<commit_message>
docs: update TASKS.md and roadmap for v1.37.2 nuke FK fix
Co-Authored-By: Claude Opus 4.6 <noreply@anthropic.com>
</commit_message>
<xml_diff>
--- a/InPlace_Roadmap.docx
+++ b/InPlace_Roadmap.docx
@@ -48,7 +48,7 @@
           <w:sz w:val="20"/>
           <w:szCs w:val="20"/>
         </w:rPr>
-        <w:t xml:space="preserve">Updated March 4, 2026  |  Current version: v1.37.1</w:t>
+        <w:t xml:space="preserve">Updated March 4, 2026  |  Current version: v1.37.2</w:t>
       </w:r>
     </w:p>
     <w:p>
@@ -565,7 +565,7 @@
                 <w:sz w:val="18"/>
                 <w:szCs w:val="18"/>
               </w:rPr>
-              <w:t xml:space="preserve">v1.35–v1.37.1</w:t>
+              <w:t xml:space="preserve">v1.35–v1.37.2</w:t>
             </w:r>
           </w:p>
         </w:tc>

</xml_diff>